<commit_message>
updated documents for presentation
all four of them
</commit_message>
<xml_diff>
--- a/Documents/bugriport.docx
+++ b/Documents/bugriport.docx
@@ -21,7 +21,7 @@
         <w:rPr>
           <w:lang w:val="hu-HU" w:eastAsia="zh-CN" w:bidi="hi-IN"/>
         </w:rPr>
-        <w:t>Drag &amp; Drop Todo webalkalmazás</w:t>
+        <w:t>Todo webalkalmazás</w:t>
       </w:r>
     </w:p>
     <w:p>
@@ -185,7 +185,7 @@
               <w:rPr>
                 <w:lang w:val="hu-HU" w:eastAsia="zh-CN" w:bidi="hi-IN"/>
               </w:rPr>
-              <w:t>Drag &amp; Drop Todo webalkalmazás</w:t>
+              <w:t>Todo webalkalmazás</w:t>
             </w:r>
           </w:p>
         </w:tc>
@@ -239,7 +239,13 @@
               <w:rPr>
                 <w:lang w:val="hu-HU" w:eastAsia="zh-CN" w:bidi="hi-IN"/>
               </w:rPr>
-              <w:t>1.1</w:t>
+              <w:t>1.</w:t>
+            </w:r>
+            <w:r>
+              <w:rPr>
+                <w:lang w:val="hu-HU" w:eastAsia="zh-CN" w:bidi="hi-IN"/>
+              </w:rPr>
+              <w:t>2</w:t>
             </w:r>
           </w:p>
         </w:tc>
@@ -293,7 +299,13 @@
               <w:rPr>
                 <w:lang w:val="hu-HU" w:eastAsia="zh-CN" w:bidi="hi-IN"/>
               </w:rPr>
-              <w:t>2026. október 05</w:t>
+              <w:t>2026. október 0</w:t>
+            </w:r>
+            <w:r>
+              <w:rPr>
+                <w:lang w:val="hu-HU" w:eastAsia="zh-CN" w:bidi="hi-IN"/>
+              </w:rPr>
+              <w:t>6</w:t>
             </w:r>
           </w:p>
         </w:tc>
@@ -381,7 +393,7 @@
         <w:rPr>
           <w:lang w:val="hu-HU" w:eastAsia="zh-CN" w:bidi="hi-IN"/>
         </w:rPr>
-        <w:t>A dokumentum célja. A Drag &amp; Drop Todo webalkalmazás működésének, felépítésének és ellenőrizhető követelményeinek részletes, beadásra kész leírása.</w:t>
+        <w:t>A dokumentum célja. A Todo webalkalmazás működésének, felépítésének és ellenőrizhető követelményeinek részletes, beadásra kész leírása.</w:t>
       </w:r>
       <w:r>
         <w:br w:type="page"/>
@@ -1377,6 +1389,7 @@
               <w:rPr>
                 <w:lang w:val="hu-HU" w:eastAsia="zh-CN" w:bidi="hi-IN"/>
               </w:rPr>
+              <w:t>0</w:t>
             </w:r>
           </w:p>
         </w:tc>
@@ -1430,6 +1443,7 @@
               <w:rPr>
                 <w:lang w:val="hu-HU" w:eastAsia="zh-CN" w:bidi="hi-IN"/>
               </w:rPr>
+              <w:t>0</w:t>
             </w:r>
           </w:p>
         </w:tc>
@@ -1483,6 +1497,7 @@
               <w:rPr>
                 <w:lang w:val="hu-HU" w:eastAsia="zh-CN" w:bidi="hi-IN"/>
               </w:rPr>
+              <w:t>2</w:t>
             </w:r>
           </w:p>
         </w:tc>
@@ -1536,6 +1551,7 @@
               <w:rPr>
                 <w:lang w:val="hu-HU" w:eastAsia="zh-CN" w:bidi="hi-IN"/>
               </w:rPr>
+              <w:t>0</w:t>
             </w:r>
           </w:p>
         </w:tc>
@@ -3396,13 +3412,12 @@
               <w:bidi w:val="0"/>
               <w:jc w:val="left"/>
               <w:rPr>
-                <w:color w:val="C9211E"/>
-                <w:lang w:val="hu-HU" w:eastAsia="zh-CN" w:bidi="hi-IN"/>
-              </w:rPr>
-            </w:pPr>
-            <w:r>
-              <w:rPr>
-                <w:color w:val="C9211E"/>
+                <w:color w:val="FF0000"/>
+              </w:rPr>
+            </w:pPr>
+            <w:r>
+              <w:rPr>
+                <w:color w:val="FF0000"/>
                 <w:lang w:val="hu-HU" w:eastAsia="zh-CN" w:bidi="hi-IN"/>
               </w:rPr>
               <w:t>Figyelmeztetés jelenik meg, funkcionálisn két megegyező indexelés: username és username_2</w:t>
@@ -3477,13 +3492,12 @@
               <w:bidi w:val="0"/>
               <w:jc w:val="left"/>
               <w:rPr>
-                <w:color w:val="C9211E"/>
-                <w:lang w:val="hu-HU" w:eastAsia="zh-CN" w:bidi="hi-IN"/>
-              </w:rPr>
-            </w:pPr>
-            <w:r>
-              <w:rPr>
-                <w:color w:val="C9211E"/>
+                <w:color w:val="FF0000"/>
+              </w:rPr>
+            </w:pPr>
+            <w:r>
+              <w:rPr>
+                <w:color w:val="FF0000"/>
                 <w:lang w:val="hu-HU" w:eastAsia="zh-CN" w:bidi="hi-IN"/>
               </w:rPr>
               <w:t>Felhasználó létrejön de a jelszó nem egyezik meg a megadottal</w:t>
@@ -3495,13 +3509,12 @@
               <w:bidi w:val="0"/>
               <w:jc w:val="left"/>
               <w:rPr>
-                <w:color w:val="C9211E"/>
-                <w:lang w:val="hu-HU" w:eastAsia="zh-CN" w:bidi="hi-IN"/>
-              </w:rPr>
-            </w:pPr>
-            <w:r>
-              <w:rPr>
-                <w:color w:val="C9211E"/>
+                <w:color w:val="FF0000"/>
+              </w:rPr>
+            </w:pPr>
+            <w:r>
+              <w:rPr>
+                <w:color w:val="FF0000"/>
                 <w:lang w:val="hu-HU" w:eastAsia="zh-CN" w:bidi="hi-IN"/>
               </w:rPr>
               <w:t>(kivéve ha a felhasználó a megadott jelszó első 64 karakterjét nem irja be)</w:t>

</xml_diff>

<commit_message>
updated the documents for todays presentation.
all four of them again and did more testing. the docs are not perfect but i cant do more.
</commit_message>
<xml_diff>
--- a/Documents/bugriport.docx
+++ b/Documents/bugriport.docx
@@ -245,7 +245,7 @@
               <w:rPr>
                 <w:lang w:val="hu-HU" w:eastAsia="zh-CN" w:bidi="hi-IN"/>
               </w:rPr>
-              <w:t>2</w:t>
+              <w:t>3</w:t>
             </w:r>
           </w:p>
         </w:tc>
@@ -299,13 +299,13 @@
               <w:rPr>
                 <w:lang w:val="hu-HU" w:eastAsia="zh-CN" w:bidi="hi-IN"/>
               </w:rPr>
-              <w:t>2026. október 0</w:t>
-            </w:r>
-            <w:r>
-              <w:rPr>
-                <w:lang w:val="hu-HU" w:eastAsia="zh-CN" w:bidi="hi-IN"/>
-              </w:rPr>
-              <w:t>6</w:t>
+              <w:t xml:space="preserve">2026. október </w:t>
+            </w:r>
+            <w:r>
+              <w:rPr>
+                <w:lang w:val="hu-HU" w:eastAsia="zh-CN" w:bidi="hi-IN"/>
+              </w:rPr>
+              <w:t>13</w:t>
             </w:r>
           </w:p>
         </w:tc>
@@ -1980,7 +1980,7 @@
               <w:rPr>
                 <w:lang w:val="hu-HU" w:eastAsia="zh-CN" w:bidi="hi-IN"/>
               </w:rPr>
-              <w:t>Javítva</w:t>
+              <w:t>Ellenőrizve</w:t>
             </w:r>
           </w:p>
         </w:tc>
@@ -2158,7 +2158,7 @@
               <w:rPr>
                 <w:lang w:val="hu-HU" w:eastAsia="zh-CN" w:bidi="hi-IN"/>
               </w:rPr>
-              <w:t>Javítva</w:t>
+              <w:t>Ellenőrizve</w:t>
             </w:r>
           </w:p>
         </w:tc>
@@ -2336,7 +2336,7 @@
               <w:rPr>
                 <w:lang w:val="hu-HU" w:eastAsia="zh-CN" w:bidi="hi-IN"/>
               </w:rPr>
-              <w:t>Új</w:t>
+              <w:t>Folyamatban</w:t>
             </w:r>
           </w:p>
         </w:tc>
@@ -2515,7 +2515,7 @@
               <w:rPr>
                 <w:lang w:val="hu-HU" w:eastAsia="zh-CN" w:bidi="hi-IN"/>
               </w:rPr>
-              <w:t>Javítva</w:t>
+              <w:t>Ellenőrizve</w:t>
             </w:r>
           </w:p>
         </w:tc>
@@ -2694,7 +2694,7 @@
               <w:rPr>
                 <w:lang w:val="hu-HU" w:eastAsia="zh-CN" w:bidi="hi-IN"/>
               </w:rPr>
-              <w:t>Javítva</w:t>
+              <w:t>Ellenőrizve</w:t>
             </w:r>
           </w:p>
         </w:tc>
@@ -2872,7 +2872,7 @@
               <w:rPr>
                 <w:lang w:val="hu-HU" w:eastAsia="zh-CN" w:bidi="hi-IN"/>
               </w:rPr>
-              <w:t>Új</w:t>
+              <w:t>Ellenőrizve</w:t>
             </w:r>
           </w:p>
         </w:tc>
@@ -3061,11 +3061,12 @@
               <w:bidi w:val="0"/>
               <w:jc w:val="left"/>
               <w:rPr>
-                <w:lang w:val="hu-HU" w:eastAsia="zh-CN" w:bidi="hi-IN"/>
-              </w:rPr>
-            </w:pPr>
-            <w:r>
-              <w:rPr>
+                <w:color w:val="000000"/>
+              </w:rPr>
+            </w:pPr>
+            <w:r>
+              <w:rPr>
+                <w:color w:val="000000"/>
                 <w:lang w:val="hu-HU" w:eastAsia="zh-CN" w:bidi="hi-IN"/>
               </w:rPr>
               <w:t>Login page → regisztráció → minden adat helyes kitöltése kivéve az email cím. Pl “asd@a”</w:t>
@@ -3087,11 +3088,12 @@
               <w:bidi w:val="0"/>
               <w:jc w:val="left"/>
               <w:rPr>
-                <w:lang w:val="hu-HU" w:eastAsia="zh-CN" w:bidi="hi-IN"/>
-              </w:rPr>
-            </w:pPr>
-            <w:r>
-              <w:rPr>
+                <w:color w:val="000000"/>
+              </w:rPr>
+            </w:pPr>
+            <w:r>
+              <w:rPr>
+                <w:color w:val="000000"/>
                 <w:lang w:val="hu-HU" w:eastAsia="zh-CN" w:bidi="hi-IN"/>
               </w:rPr>
               <w:t>Hibaüzenet jelenik meg, nem jön létre fiók</w:t>
@@ -3140,11 +3142,12 @@
               <w:bidi w:val="0"/>
               <w:jc w:val="left"/>
               <w:rPr>
-                <w:lang w:val="hu-HU" w:eastAsia="zh-CN" w:bidi="hi-IN"/>
-              </w:rPr>
-            </w:pPr>
-            <w:r>
-              <w:rPr>
+                <w:color w:val="000000"/>
+              </w:rPr>
+            </w:pPr>
+            <w:r>
+              <w:rPr>
+                <w:color w:val="000000"/>
                 <w:lang w:val="hu-HU" w:eastAsia="zh-CN" w:bidi="hi-IN"/>
               </w:rPr>
               <w:t>Login → kijelentkezés → böngésző elöző oldal visszatöltése</w:t>
@@ -3166,12 +3169,12 @@
               <w:bidi w:val="0"/>
               <w:jc w:val="left"/>
               <w:rPr>
-                <w:lang w:val="hu-HU" w:eastAsia="zh-CN" w:bidi="hi-IN"/>
-              </w:rPr>
-            </w:pPr>
-            <w:r>
-              <w:rPr>
-                <w:color w:val="FF0000"/>
+                <w:color w:val="000000"/>
+              </w:rPr>
+            </w:pPr>
+            <w:r>
+              <w:rPr>
+                <w:color w:val="000000"/>
                 <w:lang w:val="hu-HU" w:eastAsia="zh-CN" w:bidi="hi-IN"/>
               </w:rPr>
               <w:t xml:space="preserve">A todo oldal betölti a felhasználó feladatait </w:t>
@@ -3227,11 +3230,12 @@
               <w:bidi w:val="0"/>
               <w:jc w:val="left"/>
               <w:rPr>
-                <w:lang w:val="hu-HU" w:eastAsia="zh-CN" w:bidi="hi-IN"/>
-              </w:rPr>
-            </w:pPr>
-            <w:r>
-              <w:rPr>
+                <w:color w:val="000000"/>
+              </w:rPr>
+            </w:pPr>
+            <w:r>
+              <w:rPr>
+                <w:color w:val="000000"/>
                 <w:lang w:val="hu-HU" w:eastAsia="zh-CN" w:bidi="hi-IN"/>
               </w:rPr>
               <w:t>ToDo létrehozása → minden/elvégzett/kiválasztott ToDo törlése</w:t>
@@ -3253,15 +3257,22 @@
               <w:bidi w:val="0"/>
               <w:jc w:val="left"/>
               <w:rPr>
-                <w:lang w:val="hu-HU" w:eastAsia="zh-CN" w:bidi="hi-IN"/>
-              </w:rPr>
-            </w:pPr>
-            <w:r>
-              <w:rPr>
-                <w:color w:val="FF0000"/>
-                <w:lang w:val="hu-HU" w:eastAsia="zh-CN" w:bidi="hi-IN"/>
-              </w:rPr>
-              <w:t>Nincs megerősítő üzenet a tényleges törlés elött</w:t>
+                <w:color w:val="000000"/>
+              </w:rPr>
+            </w:pPr>
+            <w:r>
+              <w:rPr>
+                <w:color w:val="000000"/>
+                <w:lang w:val="hu-HU" w:eastAsia="zh-CN" w:bidi="hi-IN"/>
+              </w:rPr>
+              <w:t xml:space="preserve">Nincs megerősítő üzenet a tényleges törlés előtt, </w:t>
+            </w:r>
+            <w:r>
+              <w:rPr>
+                <w:color w:val="000000"/>
+                <w:lang w:val="hu-HU" w:eastAsia="zh-CN" w:bidi="hi-IN"/>
+              </w:rPr>
+              <w:t>csak ha az összes todot akarjuk törölni</w:t>
             </w:r>
           </w:p>
         </w:tc>
@@ -3307,11 +3318,12 @@
               <w:bidi w:val="0"/>
               <w:jc w:val="left"/>
               <w:rPr>
-                <w:lang w:val="hu-HU" w:eastAsia="zh-CN" w:bidi="hi-IN"/>
-              </w:rPr>
-            </w:pPr>
-            <w:r>
-              <w:rPr>
+                <w:color w:val="000000"/>
+              </w:rPr>
+            </w:pPr>
+            <w:r>
+              <w:rPr>
+                <w:color w:val="000000"/>
                 <w:lang w:val="hu-HU" w:eastAsia="zh-CN" w:bidi="hi-IN"/>
               </w:rPr>
               <w:t>ToDo név “      ”megadása → ToDo hozzáadása.</w:t>
@@ -3333,11 +3345,12 @@
               <w:bidi w:val="0"/>
               <w:jc w:val="left"/>
               <w:rPr>
-                <w:lang w:val="hu-HU" w:eastAsia="zh-CN" w:bidi="hi-IN"/>
-              </w:rPr>
-            </w:pPr>
-            <w:r>
-              <w:rPr>
+                <w:color w:val="000000"/>
+              </w:rPr>
+            </w:pPr>
+            <w:r>
+              <w:rPr>
+                <w:color w:val="000000"/>
                 <w:lang w:val="hu-HU" w:eastAsia="zh-CN" w:bidi="hi-IN"/>
               </w:rPr>
               <w:t>Hibaüzenet megjelenik</w:t>
@@ -3386,11 +3399,12 @@
               <w:bidi w:val="0"/>
               <w:jc w:val="left"/>
               <w:rPr>
-                <w:lang w:val="hu-HU" w:eastAsia="zh-CN" w:bidi="hi-IN"/>
-              </w:rPr>
-            </w:pPr>
-            <w:r>
-              <w:rPr>
+                <w:color w:val="000000"/>
+              </w:rPr>
+            </w:pPr>
+            <w:r>
+              <w:rPr>
+                <w:color w:val="000000"/>
                 <w:lang w:val="hu-HU" w:eastAsia="zh-CN" w:bidi="hi-IN"/>
               </w:rPr>
               <w:t>Localhostphpmyadmin → todo adatbázis → structure → indexes</w:t>
@@ -3412,12 +3426,12 @@
               <w:bidi w:val="0"/>
               <w:jc w:val="left"/>
               <w:rPr>
-                <w:color w:val="FF0000"/>
-              </w:rPr>
-            </w:pPr>
-            <w:r>
-              <w:rPr>
-                <w:color w:val="FF0000"/>
+                <w:color w:val="000000"/>
+              </w:rPr>
+            </w:pPr>
+            <w:r>
+              <w:rPr>
+                <w:color w:val="000000"/>
                 <w:lang w:val="hu-HU" w:eastAsia="zh-CN" w:bidi="hi-IN"/>
               </w:rPr>
               <w:t>Figyelmeztetés jelenik meg, funkcionálisn két megegyező indexelés: username és username_2</w:t>
@@ -3466,11 +3480,12 @@
               <w:bidi w:val="0"/>
               <w:jc w:val="left"/>
               <w:rPr>
-                <w:lang w:val="hu-HU" w:eastAsia="zh-CN" w:bidi="hi-IN"/>
-              </w:rPr>
-            </w:pPr>
-            <w:r>
-              <w:rPr>
+                <w:color w:val="000000"/>
+              </w:rPr>
+            </w:pPr>
+            <w:r>
+              <w:rPr>
+                <w:color w:val="000000"/>
                 <w:lang w:val="hu-HU" w:eastAsia="zh-CN" w:bidi="hi-IN"/>
               </w:rPr>
               <w:t>Login page → registration page → user adatok helyes megadása kivéve jelszó → 64 karakternél nagyobb jelszó megadása</w:t>
@@ -3492,12 +3507,12 @@
               <w:bidi w:val="0"/>
               <w:jc w:val="left"/>
               <w:rPr>
-                <w:color w:val="FF0000"/>
-              </w:rPr>
-            </w:pPr>
-            <w:r>
-              <w:rPr>
-                <w:color w:val="FF0000"/>
+                <w:color w:val="000000"/>
+              </w:rPr>
+            </w:pPr>
+            <w:r>
+              <w:rPr>
+                <w:color w:val="000000"/>
                 <w:lang w:val="hu-HU" w:eastAsia="zh-CN" w:bidi="hi-IN"/>
               </w:rPr>
               <w:t>Felhasználó létrejön de a jelszó nem egyezik meg a megadottal</w:t>
@@ -3509,12 +3524,12 @@
               <w:bidi w:val="0"/>
               <w:jc w:val="left"/>
               <w:rPr>
-                <w:color w:val="FF0000"/>
-              </w:rPr>
-            </w:pPr>
-            <w:r>
-              <w:rPr>
-                <w:color w:val="FF0000"/>
+                <w:color w:val="000000"/>
+              </w:rPr>
+            </w:pPr>
+            <w:r>
+              <w:rPr>
+                <w:color w:val="000000"/>
                 <w:lang w:val="hu-HU" w:eastAsia="zh-CN" w:bidi="hi-IN"/>
               </w:rPr>
               <w:t>(kivéve ha a felhasználó a megadott jelszó első 64 karakterjét nem irja be)</w:t>

</xml_diff>